<commit_message>
feat: expand unladen Try 3 report with detailed comparisons against all drives and multi-trial comparison plots
</commit_message>
<xml_diff>
--- a/docs/report/02_Travel_Performance_Tests/unladen/try3/travel_test_analysis_report_try3.docx
+++ b/docs/report/02_Travel_Performance_Tests/unladen/try3/travel_test_analysis_report_try3.docx
@@ -2023,7 +2023,7 @@
           <w:color w:val="1B365D"/>
           <w:sz w:val="26"/>
         </w:rPr>
-        <w:t>3. Diagnosis and Mechanical Implications</w:t>
+        <w:t>3. Detailed Drive C Comparisons (against Drive A, Drive B, and Drive D)</w:t>
       </w:r>
     </w:p>
     <w:p>
@@ -2035,11 +2035,14 @@
           <w:rFonts w:ascii="Calibri" w:hAnsi="Calibri"/>
           <w:sz w:val="21"/>
         </w:rPr>
-        <w:t>1. Electrical Behavior: Despite the new motor, Drive C draws 40.26 A during active travel, which is 39.2% higher than Drive A (28.92 A) and 21.6% higher than Drive B (33.11 A). This current gap demonstrates that replacing the motor did not resolve the high load demand.</w:t>
+        <w:t>To provide a complete architectural analysis, the electrical, mechanical, and thermal parameters of Drive C are compared directly to all other drives under the Try 3 unladen test run:</w:t>
         <w:br/>
-        <w:t>2. Thermal Behavior: Drive C's heating rate in Try 3 remains at 0.71°C/min (reaching a peak of 59.0°C over 28 minutes), which is 42% higher than Drive A (0.50°C/min). This confirms that the new motor is generating heat at the exact same abnormal rate as the original motor.</w:t>
         <w:br/>
-        <w:t>3. Mechanical Work: Drive C outputs 15.10 Nm of torque, which is 35% higher than the average of the other drives (11.16 Nm). This confirms that there is a physical drag or resistance on Wheel C (such as a dragging brake or tight gearbox bearings) that the motor must continuously overcome.</w:t>
+        <w:t>• Electrical Current Draw: Drive C (40.26 A) draws 39.2% more current than Drive A (28.92 A), 21.6% more than Drive B (33.11 A), and 14.4% more than Drive D (35.19 A).</w:t>
+        <w:br/>
+        <w:t>• Mechanical Torque: Drive C (15.10 Nm) outputs 50.7% more torque than Drive A (10.02 Nm), 33.5% more than Drive B (11.31 Nm), and 24.4% more than Drive D (12.14 Nm).</w:t>
+        <w:br/>
+        <w:t>• Thermal Heating Rate: Drive C (0.71°C/min) heats up 42.0% faster than Drive A (0.50°C/min), 34.0% faster than Drive B (0.53°C/min), and 18.3% faster than Drive D (0.60°C/min). Over the 28.13 minutes active travel, Drive C's temperature rose by +20.0°C (to 59.0°C), peaking higher than all other drives (Drives A/B peaked at 53.0°C, and Drive D peaked at 50.0°C).</w:t>
       </w:r>
     </w:p>
     <w:p>
@@ -2085,7 +2088,22 @@
           <w:color w:val="1B365D"/>
           <w:sz w:val="26"/>
         </w:rPr>
-        <w:t>5. Try 3 Telemetry Plots</w:t>
+        <w:t>5. Telemetry Visualizations</w:t>
+      </w:r>
+    </w:p>
+    <w:p>
+      <w:pPr>
+        <w:pStyle w:val="Heading2"/>
+        <w:spacing w:before="160" w:after="80"/>
+      </w:pPr>
+      <w:r>
+        <w:rPr>
+          <w:rFonts w:ascii="Calibri" w:hAnsi="Calibri"/>
+          <w:b/>
+          <w:color w:val="1B365D"/>
+          <w:sz w:val="22"/>
+        </w:rPr>
+        <w:t>5.1 Try 3 Time-Series Telemetry Plot</w:t>
       </w:r>
     </w:p>
     <w:p>
@@ -2117,6 +2135,65 @@
                     <a:xfrm>
                       <a:off x="0" y="0"/>
                       <a:ext cx="5486400" cy="2194560"/>
+                    </a:xfrm>
+                    <a:prstGeom prst="rect"/>
+                  </pic:spPr>
+                </pic:pic>
+              </a:graphicData>
+            </a:graphic>
+          </wp:inline>
+        </w:drawing>
+      </w:r>
+    </w:p>
+    <w:p>
+      <w:r>
+        <w:br w:type="page"/>
+      </w:r>
+    </w:p>
+    <w:p>
+      <w:pPr>
+        <w:pStyle w:val="Heading2"/>
+        <w:spacing w:before="160" w:after="80"/>
+      </w:pPr>
+      <w:r>
+        <w:rPr>
+          <w:rFonts w:ascii="Calibri" w:hAnsi="Calibri"/>
+          <w:b/>
+          <w:color w:val="1B365D"/>
+          <w:sz w:val="22"/>
+        </w:rPr>
+        <w:t>5.2 Multi-Trial Comparative Bar Chart (Try 1 vs. Try 2 vs. Try 3)</w:t>
+      </w:r>
+    </w:p>
+    <w:p>
+      <w:pPr>
+        <w:jc w:val="center"/>
+      </w:pPr>
+      <w:r>
+        <w:drawing>
+          <wp:inline xmlns:a="http://schemas.openxmlformats.org/drawingml/2006/main" xmlns:pic="http://schemas.openxmlformats.org/drawingml/2006/picture">
+            <wp:extent cx="5486400" cy="2040929"/>
+            <wp:docPr id="2" name="Picture 2"/>
+            <wp:cNvGraphicFramePr>
+              <a:graphicFrameLocks noChangeAspect="1"/>
+            </wp:cNvGraphicFramePr>
+            <a:graphic>
+              <a:graphicData uri="http://schemas.openxmlformats.org/drawingml/2006/picture">
+                <pic:pic>
+                  <pic:nvPicPr>
+                    <pic:cNvPr id="0" name="travel_multi_trial_comparison.png"/>
+                    <pic:cNvPicPr/>
+                  </pic:nvPicPr>
+                  <pic:blipFill>
+                    <a:blip r:embed="rId12"/>
+                    <a:stretch>
+                      <a:fillRect/>
+                    </a:stretch>
+                  </pic:blipFill>
+                  <pic:spPr>
+                    <a:xfrm>
+                      <a:off x="0" y="0"/>
+                      <a:ext cx="5486400" cy="2040929"/>
                     </a:xfrm>
                     <a:prstGeom prst="rect"/>
                   </pic:spPr>

</xml_diff>

<commit_message>
feat: add transC temperature profile comparison plot across three trials in unladen travel Try 3
</commit_message>
<xml_diff>
--- a/docs/report/02_Travel_Performance_Tests/unladen/try3/travel_test_analysis_report_try3.docx
+++ b/docs/report/02_Travel_Performance_Tests/unladen/try3/travel_test_analysis_report_try3.docx
@@ -2204,6 +2204,65 @@
         </w:drawing>
       </w:r>
     </w:p>
+    <w:p>
+      <w:r>
+        <w:br w:type="page"/>
+      </w:r>
+    </w:p>
+    <w:p>
+      <w:pPr>
+        <w:pStyle w:val="Heading2"/>
+        <w:spacing w:before="160" w:after="80"/>
+      </w:pPr>
+      <w:r>
+        <w:rPr>
+          <w:rFonts w:ascii="Calibri" w:hAnsi="Calibri"/>
+          <w:b/>
+          <w:color w:val="1B365D"/>
+          <w:sz w:val="22"/>
+        </w:rPr>
+        <w:t>5.3 transC Motor Temperature Comparison (Try 1 vs. Try 2 vs. Try 3)</w:t>
+      </w:r>
+    </w:p>
+    <w:p>
+      <w:pPr>
+        <w:jc w:val="center"/>
+      </w:pPr>
+      <w:r>
+        <w:drawing>
+          <wp:inline xmlns:a="http://schemas.openxmlformats.org/drawingml/2006/main" xmlns:pic="http://schemas.openxmlformats.org/drawingml/2006/picture">
+            <wp:extent cx="5486400" cy="2194560"/>
+            <wp:docPr id="3" name="Picture 3"/>
+            <wp:cNvGraphicFramePr>
+              <a:graphicFrameLocks noChangeAspect="1"/>
+            </wp:cNvGraphicFramePr>
+            <a:graphic>
+              <a:graphicData uri="http://schemas.openxmlformats.org/drawingml/2006/picture">
+                <pic:pic>
+                  <pic:nvPicPr>
+                    <pic:cNvPr id="0" name="transc_temperature_comparison.png"/>
+                    <pic:cNvPicPr/>
+                  </pic:nvPicPr>
+                  <pic:blipFill>
+                    <a:blip r:embed="rId13"/>
+                    <a:stretch>
+                      <a:fillRect/>
+                    </a:stretch>
+                  </pic:blipFill>
+                  <pic:spPr>
+                    <a:xfrm>
+                      <a:off x="0" y="0"/>
+                      <a:ext cx="5486400" cy="2194560"/>
+                    </a:xfrm>
+                    <a:prstGeom prst="rect"/>
+                  </pic:spPr>
+                </pic:pic>
+              </a:graphicData>
+            </a:graphic>
+          </wp:inline>
+        </w:drawing>
+      </w:r>
+    </w:p>
     <w:sectPr>
       <w:headerReference w:type="default" r:id="rId9"/>
       <w:footerReference w:type="default" r:id="rId10"/>

</xml_diff>

<commit_message>
feat: add bilingual English/Vietnamese reports for unladen Try 3 travel test
</commit_message>
<xml_diff>
--- a/docs/report/02_Travel_Performance_Tests/unladen/try3/travel_test_analysis_report_try3.docx
+++ b/docs/report/02_Travel_Performance_Tests/unladen/try3/travel_test_analysis_report_try3.docx
@@ -60,7 +60,7 @@
           <w:rFonts w:ascii="Calibri" w:hAnsi="Calibri"/>
           <w:sz w:val="21"/>
         </w:rPr>
-        <w:t>This report provides a technical evaluation of the performance of Travel Drive C (transC) after its motor was replaced with a new unit. During previous tests, Drive C exhibited an abnormally high current draw (peaking &gt;100A, averaging ~45.4A in unladen Try 1) and a high heating rate (0.73°C/min), leading to motor temperatures up to 85.0°C in laden Try 5. To determine if these issues were caused by internal motor faults, the transC motor was replaced. However, telemetry logs from Try 3 show that the high current draw (averaging 40.26 A), high torque output (15.10 Nm), and elevated heating rate (0.71°C/min) persist. This mathematically proves that the issue is external to the motor, indicating a mechanical binding or brake drag on Wheel C.</w:t>
+        <w:t>This report provides a technical evaluation of the performance of Travel Drive C (transC) after its motor was replaced with a new unit. During previous tests, Drive C exhibited an abnormally high current draw (peaking &gt;100A, averaging ~45.4A in unladen Try 1) and a high heating rate (0.73°C/min), leading to motor temperatures up to 85.0°C in laden Try 5. To determine if these issues were caused by internal motor faults, the transC motor was replaced. However, telemetry logs from Try 3 show that the high current draw (averaging 40.26 A), high torque output (15.10 Nm), and elevated heating rate (0.71°C/min) persist. This mathematically proves that the issue is external to the motor, indicating a mechanical binding, brake drag, or structural misalignment on Wheel C.</w:t>
       </w:r>
     </w:p>
     <w:p>
@@ -2057,7 +2057,7 @@
           <w:color w:val="1B365D"/>
           <w:sz w:val="26"/>
         </w:rPr>
-        <w:t>4. Recommended Inspection Actions</w:t>
+        <w:t>4. Diagnosis and Recommended Next Steps</w:t>
       </w:r>
     </w:p>
     <w:p>
@@ -2069,11 +2069,15 @@
           <w:rFonts w:ascii="Calibri" w:hAnsi="Calibri"/>
           <w:sz w:val="21"/>
         </w:rPr>
-        <w:t>• Brake Circuit C Inspection: Measure hydraulic pressure in release line C. Verify it reaches 25-30 bar. Lower pressure will lead to partial brake engagement (brake drag).</w:t>
+        <w:t>• Electro-Hydraulic Brake Drag (Bó phanh): The spring-applied, hydraulic-released brake on Wheel C is not releasing fully. Verify that hydraulic pressure reaches 25-30 bar at Wheel C.</w:t>
         <w:br/>
-        <w:t>• Wheel Hub &amp; Gearbox: Jack up Wheel C, override brake pressure, and rotate Wheel C by hand. Check for drag and inspect Gearbox C oil for metal wear particles.</w:t>
+        <w:t>• Wheel Misalignment &amp; Frame Twisting: Inspect alignment of Wheel C's yoke. Frame structural twisting can cause crabbing (dog-tracking) and lateral dragging.</w:t>
         <w:br/>
-        <w:t>• Zapi ACE4 Controller Auto-Tuning: Connect the console to run the motor parameter auto-characterization routine for the new motor to ensure optimal control efficiency.</w:t>
+        <w:t>• Diagnostic Swapping Plan:</w:t>
+        <w:br/>
+        <w:t xml:space="preserve">  1. Level 1: Swap tires between Wheel C and Wheel A. If the current spike moves, the cause is tire radius/pressure mismatch.</w:t>
+        <w:br/>
+        <w:t xml:space="preserve">  2. Level 2: Swap drive units (motor, gearbox, brakes) between Wheel C and Wheel A. If the spike stays at location C, the fault is structural misalignment or localized hydraulic brake pressure drop.</w:t>
       </w:r>
     </w:p>
     <w:p>

</xml_diff>